<commit_message>
test: add real document fixtures and preview regressions
</commit_message>
<xml_diff>
--- a/Survoler.Tests/TestData/sample.docx
+++ b/Survoler.Tests/TestData/sample.docx
@@ -6,9 +6,6 @@
       <w:pPr>
         <w:spacing w:beforeLines="330" w:before="792"/>
         <w:jc w:val="right"/>
-        <w:rPr>
-          <w:rFonts w:hint="eastAsia"/>
-        </w:rPr>
       </w:pPr>
       <w:r>
         <w:rPr>
@@ -56,7 +53,7 @@
       <w:pPr>
         <w:jc w:val="center"/>
         <w:rPr>
-          <w:rFonts w:ascii="新宋体" w:eastAsia="新宋体" w:hAnsi="新宋体"/>
+          <w:rFonts w:ascii="NSimSun" w:eastAsia="NSimSun" w:hAnsi="NSimSun" w:hint="eastAsia"/>
           <w:b/>
           <w:bCs/>
           <w:sz w:val="52"/>
@@ -65,7 +62,7 @@
       </w:pPr>
       <w:r>
         <w:rPr>
-          <w:rFonts w:ascii="新宋体" w:eastAsia="新宋体" w:hAnsi="新宋体"/>
+          <w:rFonts w:ascii="NSimSun" w:eastAsia="NSimSun" w:hAnsi="NSimSun"/>
           <w:b/>
           <w:bCs/>
           <w:sz w:val="52"/>
@@ -74,34 +71,64 @@
         <w:t>今天晚上吃什么</w:t>
       </w:r>
     </w:p>
+    <w:p/>
     <w:p>
       <w:pPr>
-        <w:rPr>
-          <w:rFonts w:hint="eastAsia"/>
+        <w:spacing w:line="560" w:lineRule="exact"/>
+        <w:rPr>
+          <w:rFonts w:ascii="FangSong" w:eastAsia="FangSong" w:hAnsi="FangSong" w:hint="eastAsia"/>
+          <w:sz w:val="32"/>
+          <w:szCs w:val="32"/>
         </w:rPr>
       </w:pPr>
+      <w:r>
+        <w:rPr>
+          <w:rFonts w:ascii="FangSong" w:eastAsia="FangSong" w:hAnsi="FangSong" w:hint="eastAsia"/>
+          <w:sz w:val="32"/>
+          <w:szCs w:val="32"/>
+        </w:rPr>
+        <w:t xml:space="preserve">    我们都知道，只要有意义，那么就必须慎重考虑。生活中，若今天晚上吃什么出现了，我们就不得不考虑它出现了的事实。既然如何，这不禁令我深思。了解清楚今天晚上吃什么到底是一种怎么样的存在，是解决一切问题的关键。苏轼说过，古之立大事者，不惟有超世之才，亦必有坚忍不拔之志。这似乎解答了我的疑惑</w:t>
+      </w:r>
+      <w:proofErr w:type="gramStart"/>
+      <w:r>
+        <w:rPr>
+          <w:rFonts w:ascii="FangSong" w:eastAsia="FangSong" w:hAnsi="FangSong" w:hint="eastAsia"/>
+          <w:sz w:val="32"/>
+          <w:szCs w:val="32"/>
+        </w:rPr>
+        <w:t>。。</w:t>
+      </w:r>
+      <w:proofErr w:type="gramEnd"/>
+      <w:r>
+        <w:rPr>
+          <w:rFonts w:ascii="FangSong" w:eastAsia="FangSong" w:hAnsi="FangSong" w:hint="eastAsia"/>
+          <w:sz w:val="32"/>
+          <w:szCs w:val="32"/>
+        </w:rPr>
+        <w:t>从这个角度来看，这不禁令我深思。要想清楚，今天晚上吃什么，到底是一种怎么样的存在。要想清楚，今天晚上吃什么，到底是一种怎么样的存在。这是不可避免的。王尔德说过，我们都生活在阴沟里，但仍有人仰望星空。这启发了我。今天晚上吃什么，发生了会如何，不发生又会如何。今天晚上吃什么，发生了会如何，不发生又会如何。总而言之，这不禁令我深思。</w:t>
+      </w:r>
     </w:p>
     <w:p>
       <w:pPr>
         <w:spacing w:line="560" w:lineRule="exact"/>
         <w:rPr>
-          <w:rFonts w:ascii="仿宋" w:eastAsia="仿宋" w:hAnsi="仿宋" w:hint="eastAsia"/>
+          <w:rFonts w:ascii="FangSong" w:eastAsia="FangSong" w:hAnsi="FangSong" w:hint="eastAsia"/>
           <w:sz w:val="32"/>
           <w:szCs w:val="32"/>
         </w:rPr>
       </w:pPr>
       <w:r>
         <w:rPr>
-          <w:rFonts w:ascii="仿宋" w:eastAsia="仿宋" w:hAnsi="仿宋" w:hint="eastAsia"/>
+          <w:rFonts w:ascii="FangSong" w:eastAsia="FangSong" w:hAnsi="FangSong" w:hint="eastAsia"/>
           <w:sz w:val="32"/>
           <w:szCs w:val="32"/>
         </w:rPr>
-        <w:t xml:space="preserve">    我们都知道，只要有意义，那么就必须慎重考虑。生活中，若今天晚上吃什么出现了，我们就不得不考虑它出现了的事实。既然如何，这不禁令我深思。了解清楚今天晚上吃什么到底是一种怎么样的存在，是解决一切问题的关键。苏轼说过，古之立大事者，不惟有超世之才，亦必有坚忍不拔之志。这似乎解答了我的疑惑</w:t>
+        <w:t xml:space="preserve">    而这些并不是完全重要，更加重要的问题是，这不禁令我深思。带着这些问题，我们来审视一下莎士比亚说过，那脑袋里的智慧，就像打火石里的火花一样，不去打它是不肯出来的。这似乎解答了我的疑惑</w:t>
       </w:r>
       <w:proofErr w:type="gramStart"/>
       <w:r>
         <w:rPr>
-          <w:rFonts w:ascii="仿宋" w:eastAsia="仿宋" w:hAnsi="仿宋" w:hint="eastAsia"/>
+          <w:rFonts w:ascii="FangSong" w:eastAsia="FangSong" w:hAnsi="FangSong" w:hint="eastAsia"/>
           <w:sz w:val="32"/>
           <w:szCs w:val="32"/>
         </w:rPr>
@@ -110,154 +137,160 @@
       <w:proofErr w:type="gramEnd"/>
       <w:r>
         <w:rPr>
-          <w:rFonts w:ascii="仿宋" w:eastAsia="仿宋" w:hAnsi="仿宋" w:hint="eastAsia"/>
+          <w:rFonts w:ascii="FangSong" w:eastAsia="FangSong" w:hAnsi="FangSong" w:hint="eastAsia"/>
           <w:sz w:val="32"/>
           <w:szCs w:val="32"/>
         </w:rPr>
-        <w:t>从这个角度来看，这不禁令我深思。要想清楚，今天晚上吃什么，到底是一种怎么样的存在。要想清楚，今天晚上吃什么，到底是一种怎么样的存在。这是不可避免的。王尔德说过，我们都生活在阴沟里，但仍有人仰望星空。这启发了我</w:t>
-      </w:r>
-      <w:proofErr w:type="gramStart"/>
-      <w:r>
-        <w:rPr>
-          <w:rFonts w:ascii="仿宋" w:eastAsia="仿宋" w:hAnsi="仿宋" w:hint="eastAsia"/>
+        <w:t>就我个人来说，今天晚上吃什么对我的意义，不能不说非常重大。带着这些问题，我们来审视一下现在，解决今天晚上吃什么</w:t>
+      </w:r>
+      <w:r>
+        <w:rPr>
+          <w:rFonts w:ascii="FangSong" w:eastAsia="FangSong" w:hAnsi="FangSong" w:hint="eastAsia"/>
           <w:sz w:val="32"/>
           <w:szCs w:val="32"/>
         </w:rPr>
-        <w:t>，。</w:t>
-      </w:r>
-      <w:proofErr w:type="gramEnd"/>
-      <w:r>
-        <w:rPr>
-          <w:rFonts w:ascii="仿宋" w:eastAsia="仿宋" w:hAnsi="仿宋" w:hint="eastAsia"/>
-          <w:sz w:val="32"/>
-          <w:szCs w:val="32"/>
-        </w:rPr>
-        <w:t>今天晚上吃什么，发生了会如何，不发生又会如何。今天晚上吃什么，发生了会如何，不发生又会如何。总而言之，这不禁令我深思。</w:t>
+        <w:lastRenderedPageBreak/>
+        <w:t>的问题，是非常非常重要的。 所以，这不禁令我深思。了解清楚今天晚上吃什么到底是一种怎么样的存在，是解决一切问题的关键。问题的关键究竟为何？</w:t>
       </w:r>
     </w:p>
     <w:p>
       <w:pPr>
         <w:spacing w:line="560" w:lineRule="exact"/>
         <w:rPr>
-          <w:rFonts w:ascii="仿宋" w:eastAsia="仿宋" w:hAnsi="仿宋"/>
+          <w:rFonts w:ascii="FangSong" w:eastAsia="FangSong" w:hAnsi="FangSong" w:hint="eastAsia"/>
           <w:sz w:val="32"/>
           <w:szCs w:val="32"/>
+        </w:rPr>
+      </w:pPr>
+      <w:r>
+        <w:rPr>
+          <w:rFonts w:ascii="FangSong" w:eastAsia="FangSong" w:hAnsi="FangSong" w:hint="eastAsia"/>
+          <w:sz w:val="32"/>
+          <w:szCs w:val="32"/>
+        </w:rPr>
+        <w:t xml:space="preserve">    那么，这不禁令我深思。莎士比亚说过，那脑袋里的智慧，就像打火石里的火花一样，不去打它是不肯出来的。这启发了我</w:t>
+      </w:r>
+      <w:proofErr w:type="gramStart"/>
+      <w:r>
+        <w:rPr>
+          <w:rFonts w:ascii="FangSong" w:eastAsia="FangSong" w:hAnsi="FangSong" w:hint="eastAsia"/>
+          <w:sz w:val="32"/>
+          <w:szCs w:val="32"/>
+        </w:rPr>
+        <w:t>，。</w:t>
+      </w:r>
+      <w:proofErr w:type="gramEnd"/>
+      <w:r>
+        <w:rPr>
+          <w:rFonts w:ascii="FangSong" w:eastAsia="FangSong" w:hAnsi="FangSong" w:hint="eastAsia"/>
+          <w:sz w:val="32"/>
+          <w:szCs w:val="32"/>
+        </w:rPr>
+        <w:t>我们都知道，只要有意义，那么就必须慎重考虑。总结的来说，这不禁令我深思。歌德曾经说过，流水在碰到底处时才会释放活力。这启发了我</w:t>
+      </w:r>
+      <w:proofErr w:type="gramStart"/>
+      <w:r>
+        <w:rPr>
+          <w:rFonts w:ascii="FangSong" w:eastAsia="FangSong" w:hAnsi="FangSong" w:hint="eastAsia"/>
+          <w:sz w:val="32"/>
+          <w:szCs w:val="32"/>
+        </w:rPr>
+        <w:t>，。</w:t>
+      </w:r>
+      <w:proofErr w:type="gramEnd"/>
+      <w:r>
+        <w:rPr>
+          <w:rFonts w:ascii="FangSong" w:eastAsia="FangSong" w:hAnsi="FangSong" w:hint="eastAsia"/>
+          <w:sz w:val="32"/>
+          <w:szCs w:val="32"/>
+        </w:rPr>
+        <w:t>要想清楚，今天晚上吃什么，到底是一种怎么样的存在。可是，即使是这样，今天晚上吃什么的出现仍然代表了一定的意义。</w:t>
+      </w:r>
+    </w:p>
+    <w:p>
+      <w:pPr>
+        <w:rPr>
+          <w:rFonts w:hint="eastAsia"/>
         </w:rPr>
       </w:pPr>
     </w:p>
     <w:p>
-      <w:pPr>
-        <w:spacing w:line="560" w:lineRule="exact"/>
-        <w:rPr>
-          <w:rFonts w:ascii="仿宋" w:eastAsia="仿宋" w:hAnsi="仿宋" w:hint="eastAsia"/>
-          <w:sz w:val="32"/>
-          <w:szCs w:val="32"/>
-        </w:rPr>
-      </w:pPr>
-      <w:r>
-        <w:rPr>
-          <w:rFonts w:ascii="仿宋" w:eastAsia="仿宋" w:hAnsi="仿宋" w:hint="eastAsia"/>
-          <w:sz w:val="32"/>
-          <w:szCs w:val="32"/>
-        </w:rPr>
-        <w:t xml:space="preserve">    而这些并不是完全重要，更加重要的问题是，这不禁令我深思。带着这些问题，我们来审视一下莎士比亚说过，那脑袋里的智慧，就像打火石里的火花一样，不去打它是不肯出来的。这似乎解答了我的疑惑</w:t>
-      </w:r>
-      <w:proofErr w:type="gramStart"/>
-      <w:r>
-        <w:rPr>
-          <w:rFonts w:ascii="仿宋" w:eastAsia="仿宋" w:hAnsi="仿宋" w:hint="eastAsia"/>
-          <w:sz w:val="32"/>
-          <w:szCs w:val="32"/>
-        </w:rPr>
-        <w:t>。。</w:t>
-      </w:r>
-      <w:proofErr w:type="gramEnd"/>
-      <w:r>
-        <w:rPr>
-          <w:rFonts w:ascii="仿宋" w:eastAsia="仿宋" w:hAnsi="仿宋" w:hint="eastAsia"/>
-          <w:sz w:val="32"/>
-          <w:szCs w:val="32"/>
-        </w:rPr>
-        <w:t>就我个人来说，今天晚上吃什么对我的意义，不能不说非常重大。带</w:t>
-      </w:r>
-      <w:r>
-        <w:rPr>
-          <w:rFonts w:ascii="仿宋" w:eastAsia="仿宋" w:hAnsi="仿宋" w:hint="eastAsia"/>
-          <w:sz w:val="32"/>
-          <w:szCs w:val="32"/>
-        </w:rPr>
-        <w:lastRenderedPageBreak/>
-        <w:t>着这些问题，我们来审视一下现在，解决今天晚上吃什么的问题，是非常非常重要的。 所以，这不禁令我深思。了解清楚今天晚上吃什么到底是一种怎么样的存在，是解决一切问题的关键。问题的关键究竟为何？</w:t>
-      </w:r>
-    </w:p>
-    <w:p>
-      <w:pPr>
-        <w:spacing w:line="560" w:lineRule="exact"/>
-        <w:rPr>
-          <w:rFonts w:ascii="仿宋" w:eastAsia="仿宋" w:hAnsi="仿宋"/>
-          <w:sz w:val="32"/>
-          <w:szCs w:val="32"/>
-        </w:rPr>
-      </w:pPr>
-    </w:p>
-    <w:p>
-      <w:pPr>
-        <w:spacing w:line="560" w:lineRule="exact"/>
-        <w:rPr>
-          <w:rFonts w:ascii="仿宋" w:eastAsia="仿宋" w:hAnsi="仿宋"/>
-          <w:sz w:val="32"/>
-          <w:szCs w:val="32"/>
-        </w:rPr>
-      </w:pPr>
-      <w:r>
-        <w:rPr>
-          <w:rFonts w:ascii="仿宋" w:eastAsia="仿宋" w:hAnsi="仿宋" w:hint="eastAsia"/>
-          <w:sz w:val="32"/>
-          <w:szCs w:val="32"/>
-        </w:rPr>
-        <w:t xml:space="preserve">    那么，这不禁令我深思。莎士比亚说过，那脑袋里的智慧，就像打火石里的火花一样，不去打它是不肯出来的。这启发了我</w:t>
-      </w:r>
-      <w:proofErr w:type="gramStart"/>
-      <w:r>
-        <w:rPr>
-          <w:rFonts w:ascii="仿宋" w:eastAsia="仿宋" w:hAnsi="仿宋" w:hint="eastAsia"/>
-          <w:sz w:val="32"/>
-          <w:szCs w:val="32"/>
-        </w:rPr>
-        <w:t>，。</w:t>
-      </w:r>
-      <w:proofErr w:type="gramEnd"/>
-      <w:r>
-        <w:rPr>
-          <w:rFonts w:ascii="仿宋" w:eastAsia="仿宋" w:hAnsi="仿宋" w:hint="eastAsia"/>
-          <w:sz w:val="32"/>
-          <w:szCs w:val="32"/>
-        </w:rPr>
-        <w:t>我们都知道，只要有意义，那么就必须慎重考虑。总结的来说，这不禁令我深思。歌德曾经说过，流水在碰到底处时才会释放活力。这启发了我</w:t>
-      </w:r>
-      <w:proofErr w:type="gramStart"/>
-      <w:r>
-        <w:rPr>
-          <w:rFonts w:ascii="仿宋" w:eastAsia="仿宋" w:hAnsi="仿宋" w:hint="eastAsia"/>
-          <w:sz w:val="32"/>
-          <w:szCs w:val="32"/>
-        </w:rPr>
-        <w:t>，。</w:t>
-      </w:r>
-      <w:proofErr w:type="gramEnd"/>
-      <w:r>
-        <w:rPr>
-          <w:rFonts w:ascii="仿宋" w:eastAsia="仿宋" w:hAnsi="仿宋" w:hint="eastAsia"/>
-          <w:sz w:val="32"/>
-          <w:szCs w:val="32"/>
-        </w:rPr>
-        <w:t>要想清楚，今天晚上吃什么，到底是一种怎么样的存在。可是，即使是这样，今天晚上吃什么的出现仍然代表了一定的意义。</w:t>
-      </w:r>
-    </w:p>
-    <w:p/>
-    <w:p/>
-    <w:p/>
-    <w:p>
+      <w:r>
+        <w:rPr>
+          <w:noProof/>
+        </w:rPr>
+        <mc:AlternateContent>
+          <mc:Choice Requires="wps">
+            <w:drawing>
+              <wp:anchor distT="0" distB="0" distL="114300" distR="114300" simplePos="0" relativeHeight="251659264" behindDoc="0" locked="0" layoutInCell="1" allowOverlap="1" wp14:anchorId="53D32C95" wp14:editId="6B3360DA">
+                <wp:simplePos x="0" y="0"/>
+                <wp:positionH relativeFrom="column">
+                  <wp:posOffset>878774</wp:posOffset>
+                </wp:positionH>
+                <wp:positionV relativeFrom="paragraph">
+                  <wp:posOffset>111732</wp:posOffset>
+                </wp:positionV>
+                <wp:extent cx="3457575" cy="2447925"/>
+                <wp:effectExtent l="0" t="0" r="0" b="0"/>
+                <wp:wrapNone/>
+                <wp:docPr id="1156230576" name="箭头: 环形 1"/>
+                <wp:cNvGraphicFramePr/>
+                <a:graphic xmlns:a="http://schemas.openxmlformats.org/drawingml/2006/main">
+                  <a:graphicData uri="http://schemas.microsoft.com/office/word/2010/wordprocessingShape">
+                    <wps:wsp>
+                      <wps:cNvSpPr/>
+                      <wps:spPr>
+                        <a:xfrm>
+                          <a:off x="0" y="0"/>
+                          <a:ext cx="3457575" cy="2447925"/>
+                        </a:xfrm>
+                        <a:prstGeom prst="circularArrow">
+                          <a:avLst>
+                            <a:gd name="adj1" fmla="val 12500"/>
+                            <a:gd name="adj2" fmla="val 2111767"/>
+                            <a:gd name="adj3" fmla="val 20457681"/>
+                            <a:gd name="adj4" fmla="val 10800000"/>
+                            <a:gd name="adj5" fmla="val 12500"/>
+                          </a:avLst>
+                        </a:prstGeom>
+                      </wps:spPr>
+                      <wps:style>
+                        <a:lnRef idx="2">
+                          <a:schemeClr val="accent1">
+                            <a:shade val="15000"/>
+                          </a:schemeClr>
+                        </a:lnRef>
+                        <a:fillRef idx="1">
+                          <a:schemeClr val="accent1"/>
+                        </a:fillRef>
+                        <a:effectRef idx="0">
+                          <a:schemeClr val="accent1"/>
+                        </a:effectRef>
+                        <a:fontRef idx="minor">
+                          <a:schemeClr val="lt1"/>
+                        </a:fontRef>
+                      </wps:style>
+                      <wps:bodyPr rot="0" spcFirstLastPara="0" vertOverflow="overflow" horzOverflow="overflow" vert="horz" wrap="square" lIns="91440" tIns="45720" rIns="91440" bIns="45720" numCol="1" spcCol="0" rtlCol="0" fromWordArt="0" anchor="ctr" anchorCtr="0" forceAA="0" compatLnSpc="1">
+                        <a:prstTxWarp prst="textNoShape">
+                          <a:avLst/>
+                        </a:prstTxWarp>
+                        <a:noAutofit/>
+                      </wps:bodyPr>
+                    </wps:wsp>
+                  </a:graphicData>
+                </a:graphic>
+              </wp:anchor>
+            </w:drawing>
+          </mc:Choice>
+          <mc:Fallback>
+            <w:pict>
+              <v:shape w14:anchorId="43C7F2BB" id="箭头: 环形 1" o:spid="_x0000_s1026" style="position:absolute;margin-left:69.2pt;margin-top:8.8pt;width:272.25pt;height:192.75pt;z-index:251659264;visibility:visible;mso-wrap-style:square;mso-wrap-distance-left:9pt;mso-wrap-distance-top:0;mso-wrap-distance-right:9pt;mso-wrap-distance-bottom:0;mso-position-horizontal:absolute;mso-position-horizontal-relative:text;mso-position-vertical:absolute;mso-position-vertical-relative:text;v-text-anchor:middle" coordsize="3457575,2447925" o:gfxdata="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" path="m152995,1223963v,-557074,628376,-1021125,1445222,-1067284c2305683,116701,2965135,403167,3208827,856329r68480,19838l3026727,1600004,2689499,705866r-48494,-14049c2351867,511931,1934898,428682,1524659,468935,910252,529221,458984,848944,458984,1223963r-305989,xe" fillcolor="#4472c4 [3204]" strokecolor="#09101d [484]" strokeweight="1pt">
+                <v:path arrowok="t" o:connecttype="custom" o:connectlocs="152995,1223963;1598217,156679;3208827,856329;3277307,876167;3026727,1600004;2689499,705866;2641005,691817;1524659,468935;458984,1223963;152995,1223963" o:connectangles="0,0,0,0,0,0,0,0,0,0"/>
+              </v:shape>
+            </w:pict>
+          </mc:Fallback>
+        </mc:AlternateContent>
+      </w:r>
       <w:r>
         <w:rPr>
           <w:b/>
@@ -695,6 +728,234 @@
           <w:color w:val="7030A0"/>
         </w:rPr>
         <w:t>y shore.</w:t>
+      </w:r>
+      <w:r>
+        <w:rPr>
+          <w:b/>
+          <w:bCs/>
+          <w:color w:val="7030A0"/>
+        </w:rPr>
+        <w:t xml:space="preserve"> </w:t>
+      </w:r>
+      <w:r>
+        <w:rPr>
+          <w:b/>
+          <w:bCs/>
+          <w:color w:val="7030A0"/>
+        </w:rPr>
+        <w:drawing>
+          <wp:inline distT="0" distB="0" distL="0" distR="0" wp14:anchorId="53F97684" wp14:editId="3A8F26C7">
+            <wp:extent cx="2466975" cy="1457325"/>
+            <wp:effectExtent l="0" t="0" r="0" b="0"/>
+            <wp:docPr id="1978464481" name="图片 11"/>
+            <wp:cNvGraphicFramePr>
+              <a:graphicFrameLocks xmlns:a="http://schemas.openxmlformats.org/drawingml/2006/main" noChangeAspect="1"/>
+            </wp:cNvGraphicFramePr>
+            <a:graphic xmlns:a="http://schemas.openxmlformats.org/drawingml/2006/main">
+              <a:graphicData uri="http://schemas.openxmlformats.org/drawingml/2006/picture">
+                <pic:pic xmlns:pic="http://schemas.openxmlformats.org/drawingml/2006/picture">
+                  <pic:nvPicPr>
+                    <pic:cNvPr id="0" name="Picture 21"/>
+                    <pic:cNvPicPr>
+                      <a:picLocks noChangeAspect="1" noChangeArrowheads="1"/>
+                    </pic:cNvPicPr>
+                  </pic:nvPicPr>
+                  <pic:blipFill>
+                    <a:blip r:embed="rId6" cstate="print">
+                      <a:extLst>
+                        <a:ext uri="{28A0092B-C50C-407E-A947-70E740481C1C}">
+                          <a14:useLocalDpi xmlns:a14="http://schemas.microsoft.com/office/drawing/2010/main" val="0"/>
+                        </a:ext>
+                      </a:extLst>
+                    </a:blip>
+                    <a:srcRect/>
+                    <a:stretch>
+                      <a:fillRect/>
+                    </a:stretch>
+                  </pic:blipFill>
+                  <pic:spPr bwMode="auto">
+                    <a:xfrm>
+                      <a:off x="0" y="0"/>
+                      <a:ext cx="2466975" cy="1457325"/>
+                    </a:xfrm>
+                    <a:prstGeom prst="rect">
+                      <a:avLst/>
+                    </a:prstGeom>
+                    <a:noFill/>
+                    <a:ln>
+                      <a:noFill/>
+                    </a:ln>
+                  </pic:spPr>
+                </pic:pic>
+              </a:graphicData>
+            </a:graphic>
+          </wp:inline>
+        </w:drawing>
+      </w:r>
+      <w:r>
+        <w:rPr>
+          <w:b/>
+          <w:bCs/>
+          <w:color w:val="7030A0"/>
+        </w:rPr>
+        <w:drawing>
+          <wp:inline distT="0" distB="0" distL="0" distR="0" wp14:anchorId="24448065" wp14:editId="3FE475FC">
+            <wp:extent cx="2305050" cy="1533525"/>
+            <wp:effectExtent l="0" t="0" r="0" b="9525"/>
+            <wp:docPr id="1270803661" name="图片 10"/>
+            <wp:cNvGraphicFramePr>
+              <a:graphicFrameLocks xmlns:a="http://schemas.openxmlformats.org/drawingml/2006/main" noChangeAspect="1"/>
+            </wp:cNvGraphicFramePr>
+            <a:graphic xmlns:a="http://schemas.openxmlformats.org/drawingml/2006/main">
+              <a:graphicData uri="http://schemas.openxmlformats.org/drawingml/2006/picture">
+                <pic:pic xmlns:pic="http://schemas.openxmlformats.org/drawingml/2006/picture">
+                  <pic:nvPicPr>
+                    <pic:cNvPr id="0" name="Picture 22"/>
+                    <pic:cNvPicPr>
+                      <a:picLocks noChangeAspect="1" noChangeArrowheads="1"/>
+                    </pic:cNvPicPr>
+                  </pic:nvPicPr>
+                  <pic:blipFill>
+                    <a:blip r:embed="rId7" cstate="print">
+                      <a:extLst>
+                        <a:ext uri="{28A0092B-C50C-407E-A947-70E740481C1C}">
+                          <a14:useLocalDpi xmlns:a14="http://schemas.microsoft.com/office/drawing/2010/main" val="0"/>
+                        </a:ext>
+                      </a:extLst>
+                    </a:blip>
+                    <a:srcRect/>
+                    <a:stretch>
+                      <a:fillRect/>
+                    </a:stretch>
+                  </pic:blipFill>
+                  <pic:spPr bwMode="auto">
+                    <a:xfrm>
+                      <a:off x="0" y="0"/>
+                      <a:ext cx="2305050" cy="1533525"/>
+                    </a:xfrm>
+                    <a:prstGeom prst="rect">
+                      <a:avLst/>
+                    </a:prstGeom>
+                    <a:noFill/>
+                    <a:ln>
+                      <a:noFill/>
+                    </a:ln>
+                  </pic:spPr>
+                </pic:pic>
+              </a:graphicData>
+            </a:graphic>
+          </wp:inline>
+        </w:drawing>
+      </w:r>
+      <w:r>
+        <w:rPr>
+          <w:b/>
+          <w:bCs/>
+          <w:color w:val="7030A0"/>
+        </w:rPr>
+        <w:drawing>
+          <wp:inline distT="0" distB="0" distL="0" distR="0" wp14:anchorId="72FE5F61" wp14:editId="7ADE5EB6">
+            <wp:extent cx="1790700" cy="1143000"/>
+            <wp:effectExtent l="0" t="0" r="0" b="0"/>
+            <wp:docPr id="1489463821" name="图片 9"/>
+            <wp:cNvGraphicFramePr>
+              <a:graphicFrameLocks xmlns:a="http://schemas.openxmlformats.org/drawingml/2006/main" noChangeAspect="1"/>
+            </wp:cNvGraphicFramePr>
+            <a:graphic xmlns:a="http://schemas.openxmlformats.org/drawingml/2006/main">
+              <a:graphicData uri="http://schemas.openxmlformats.org/drawingml/2006/picture">
+                <pic:pic xmlns:pic="http://schemas.openxmlformats.org/drawingml/2006/picture">
+                  <pic:nvPicPr>
+                    <pic:cNvPr id="0" name="Picture 23"/>
+                    <pic:cNvPicPr>
+                      <a:picLocks noChangeAspect="1" noChangeArrowheads="1"/>
+                    </pic:cNvPicPr>
+                  </pic:nvPicPr>
+                  <pic:blipFill>
+                    <a:blip r:embed="rId8" cstate="print">
+                      <a:extLst>
+                        <a:ext uri="{28A0092B-C50C-407E-A947-70E740481C1C}">
+                          <a14:useLocalDpi xmlns:a14="http://schemas.microsoft.com/office/drawing/2010/main" val="0"/>
+                        </a:ext>
+                      </a:extLst>
+                    </a:blip>
+                    <a:srcRect t="41000" b="16275"/>
+                    <a:stretch>
+                      <a:fillRect/>
+                    </a:stretch>
+                  </pic:blipFill>
+                  <pic:spPr bwMode="auto">
+                    <a:xfrm>
+                      <a:off x="0" y="0"/>
+                      <a:ext cx="1790700" cy="1143000"/>
+                    </a:xfrm>
+                    <a:prstGeom prst="rect">
+                      <a:avLst/>
+                    </a:prstGeom>
+                    <a:noFill/>
+                    <a:ln>
+                      <a:noFill/>
+                    </a:ln>
+                  </pic:spPr>
+                </pic:pic>
+              </a:graphicData>
+            </a:graphic>
+          </wp:inline>
+        </w:drawing>
+      </w:r>
+      <w:r>
+        <w:rPr>
+          <w:b/>
+          <w:bCs/>
+          <w:color w:val="7030A0"/>
+        </w:rPr>
+        <w:drawing>
+          <wp:inline distT="0" distB="0" distL="0" distR="0" wp14:anchorId="239E1163" wp14:editId="2D17888D">
+            <wp:extent cx="1447800" cy="1114425"/>
+            <wp:effectExtent l="0" t="0" r="0" b="0"/>
+            <wp:docPr id="2066056525" name="图片 8"/>
+            <wp:cNvGraphicFramePr>
+              <a:graphicFrameLocks xmlns:a="http://schemas.openxmlformats.org/drawingml/2006/main" noChangeAspect="1"/>
+            </wp:cNvGraphicFramePr>
+            <a:graphic xmlns:a="http://schemas.openxmlformats.org/drawingml/2006/main">
+              <a:graphicData uri="http://schemas.openxmlformats.org/drawingml/2006/picture">
+                <pic:pic xmlns:pic="http://schemas.openxmlformats.org/drawingml/2006/picture">
+                  <pic:nvPicPr>
+                    <pic:cNvPr id="0" name="Picture 24"/>
+                    <pic:cNvPicPr>
+                      <a:picLocks noChangeAspect="1" noChangeArrowheads="1"/>
+                    </pic:cNvPicPr>
+                  </pic:nvPicPr>
+                  <pic:blipFill>
+                    <a:blip r:embed="rId9" cstate="print">
+                      <a:extLst>
+                        <a:ext uri="{28A0092B-C50C-407E-A947-70E740481C1C}">
+                          <a14:useLocalDpi xmlns:a14="http://schemas.microsoft.com/office/drawing/2010/main" val="0"/>
+                        </a:ext>
+                      </a:extLst>
+                    </a:blip>
+                    <a:srcRect l="8920" t="56546" r="31949" b="12932"/>
+                    <a:stretch>
+                      <a:fillRect/>
+                    </a:stretch>
+                  </pic:blipFill>
+                  <pic:spPr bwMode="auto">
+                    <a:xfrm>
+                      <a:off x="0" y="0"/>
+                      <a:ext cx="1447800" cy="1114425"/>
+                    </a:xfrm>
+                    <a:prstGeom prst="rect">
+                      <a:avLst/>
+                    </a:prstGeom>
+                    <a:noFill/>
+                    <a:ln>
+                      <a:noFill/>
+                    </a:ln>
+                  </pic:spPr>
+                </pic:pic>
+              </a:graphicData>
+            </a:graphic>
+          </wp:inline>
+        </w:drawing>
       </w:r>
     </w:p>
     <w:p/>
@@ -830,7 +1091,6 @@
                 <v:path gradientshapeok="t" o:connecttype="rect"/>
               </v:shapetype>
               <v:shape id="文本框 1" o:spid="_x0000_s1026" type="#_x0000_t202" style="position:absolute;margin-left:0;margin-top:0;width:2in;height:2in;z-index:251661312;visibility:visible;mso-wrap-style:none;mso-wrap-distance-left:9pt;mso-wrap-distance-top:0;mso-wrap-distance-right:9pt;mso-wrap-distance-bottom:0;mso-position-horizontal:absolute;mso-position-horizontal-relative:text;mso-position-vertical:absolute;mso-position-vertical-relative:text;v-text-anchor:top" o:gfxdata="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" filled="f" stroked="f">
-                <v:fill o:detectmouseclick="t"/>
                 <v:textbox style="mso-fit-shape-to-text:t">
                   <w:txbxContent>
                     <w:p>
@@ -912,85 +1172,9 @@
         </mc:AlternateContent>
       </w:r>
     </w:p>
-    <w:p>
-      <w:pPr>
-        <w:rPr>
-          <w:rFonts w:hint="eastAsia"/>
-        </w:rPr>
-      </w:pPr>
-      <w:r>
-        <w:rPr>
-          <w:noProof/>
-        </w:rPr>
-        <mc:AlternateContent>
-          <mc:Choice Requires="wps">
-            <w:drawing>
-              <wp:anchor distT="0" distB="0" distL="114300" distR="114300" simplePos="0" relativeHeight="251659264" behindDoc="0" locked="0" layoutInCell="1" allowOverlap="1" wp14:anchorId="53D32C95" wp14:editId="64CF0D52">
-                <wp:simplePos x="0" y="0"/>
-                <wp:positionH relativeFrom="column">
-                  <wp:posOffset>-85725</wp:posOffset>
-                </wp:positionH>
-                <wp:positionV relativeFrom="paragraph">
-                  <wp:posOffset>422910</wp:posOffset>
-                </wp:positionV>
-                <wp:extent cx="3457575" cy="2447925"/>
-                <wp:effectExtent l="0" t="0" r="0" b="0"/>
-                <wp:wrapNone/>
-                <wp:docPr id="1156230576" name="箭头: 环形 1"/>
-                <wp:cNvGraphicFramePr/>
-                <a:graphic xmlns:a="http://schemas.openxmlformats.org/drawingml/2006/main">
-                  <a:graphicData uri="http://schemas.microsoft.com/office/word/2010/wordprocessingShape">
-                    <wps:wsp>
-                      <wps:cNvSpPr/>
-                      <wps:spPr>
-                        <a:xfrm>
-                          <a:off x="0" y="0"/>
-                          <a:ext cx="3457575" cy="2447925"/>
-                        </a:xfrm>
-                        <a:prstGeom prst="circularArrow">
-                          <a:avLst/>
-                        </a:prstGeom>
-                      </wps:spPr>
-                      <wps:style>
-                        <a:lnRef idx="2">
-                          <a:schemeClr val="accent1">
-                            <a:shade val="15000"/>
-                          </a:schemeClr>
-                        </a:lnRef>
-                        <a:fillRef idx="1">
-                          <a:schemeClr val="accent1"/>
-                        </a:fillRef>
-                        <a:effectRef idx="0">
-                          <a:schemeClr val="accent1"/>
-                        </a:effectRef>
-                        <a:fontRef idx="minor">
-                          <a:schemeClr val="lt1"/>
-                        </a:fontRef>
-                      </wps:style>
-                      <wps:bodyPr rot="0" spcFirstLastPara="0" vertOverflow="overflow" horzOverflow="overflow" vert="horz" wrap="square" lIns="91440" tIns="45720" rIns="91440" bIns="45720" numCol="1" spcCol="0" rtlCol="0" fromWordArt="0" anchor="ctr" anchorCtr="0" forceAA="0" compatLnSpc="1">
-                        <a:prstTxWarp prst="textNoShape">
-                          <a:avLst/>
-                        </a:prstTxWarp>
-                        <a:noAutofit/>
-                      </wps:bodyPr>
-                    </wps:wsp>
-                  </a:graphicData>
-                </a:graphic>
-              </wp:anchor>
-            </w:drawing>
-          </mc:Choice>
-          <mc:Fallback>
-            <w:pict>
-              <v:shape w14:anchorId="3298B47A" id="箭头: 环形 1" o:spid="_x0000_s1026" style="position:absolute;margin-left:-6.75pt;margin-top:33.3pt;width:272.25pt;height:192.75pt;z-index:251659264;visibility:visible;mso-wrap-style:square;mso-wrap-distance-left:9pt;mso-wrap-distance-top:0;mso-wrap-distance-right:9pt;mso-wrap-distance-bottom:0;mso-position-horizontal:absolute;mso-position-horizontal-relative:text;mso-position-vertical:absolute;mso-position-vertical-relative:text;v-text-anchor:middle" coordsize="3457575,2447925" o:gfxdata="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" path="m152995,1223963v,-550262,613559,-1010981,1419192,-1065665c2250059,112286,2894681,367538,3170078,791018r119315,-1l3151584,1223962,2677412,791017r98242,c2508322,556414,2046926,430595,1577920,464404,939536,510423,458984,836632,458984,1223963r-305989,xe" fillcolor="#4472c4 [3204]" strokecolor="#09101d [484]" strokeweight="1pt">
-                <v:path arrowok="t" o:connecttype="custom" o:connectlocs="152995,1223963;1572187,158298;3170078,791018;3289393,791017;3151584,1223962;2677412,791017;2775654,791017;1577920,464404;458984,1223963;152995,1223963" o:connectangles="0,0,0,0,0,0,0,0,0,0"/>
-              </v:shape>
-            </w:pict>
-          </mc:Fallback>
-        </mc:AlternateContent>
-      </w:r>
-    </w:p>
+    <w:p/>
     <w:sectPr>
-      <w:headerReference w:type="first" r:id="rId6"/>
+      <w:headerReference w:type="first" r:id="rId10"/>
       <w:pgSz w:w="11906" w:h="16838"/>
       <w:pgMar w:top="1440" w:right="1797" w:bottom="1440" w:left="1797" w:header="720" w:footer="720" w:gutter="0"/>
       <w:cols w:space="720"/>
@@ -1061,7 +1245,7 @@
         <w:tab w:val="center" w:pos="4156"/>
       </w:tabs>
       <w:rPr>
-        <w:rFonts w:ascii="华文中宋" w:eastAsia="华文中宋" w:hAnsi="华文中宋"/>
+        <w:rFonts w:ascii="华文中宋" w:eastAsia="华文中宋" w:hAnsi="华文中宋" w:hint="eastAsia"/>
         <w:color w:val="EE0000"/>
         <w:w w:val="80"/>
         <w:sz w:val="96"/>

</xml_diff>